<commit_message>
Release 1.17.0 — per-office To Do/MB, What's New dialog, doc fixes
Carries the 1.16.0 work that was published from an uncommitted tree (Photos/PDF
→ Word/Excel tool, GPS overlay OCR accuracy, Tender Notice office fill, Word2007
sectPr fix, Work Order ECV, Bid Document), plus this release's changes:

- To Do List and MB Scrutiny list are now scoped per office (officeKey), like
  the Works List — a task/MB added under one circle no longer shows in another.
- Completion Report: blank Estimate Amount stays blank (no "Rs 0/-"); the stray
  "dt." is gone when there is no Technical Sanction date (combined placeholder).
- "What's New" dialog on the first launch after an update, driven by a versioned
  changelog (core/changelog.ts).

Co-Authored-By: Claude Opus 4.8 <noreply@anthropic.com>
</commit_message>
<xml_diff>
--- a/resources/file-backer-template.docx
+++ b/resources/file-backer-template.docx
@@ -275,6 +275,91 @@
                 <w:szCs w:val="24"/>
               </w:rPr>
               <w:t xml:space="preserve">{{Estimate Amount}}</w:t>
+            </w:r>
+          </w:p>
+        </w:tc>
+      </w:tr>
+      <w:tr>
+        <w:trPr>
+          <w:cantSplit/>
+          <w:trHeight w:val="812"/>
+          <w:tblCellSpacing w:w="0" w:type="dxa"/>
+          <w:jc w:val="center"/>
+        </w:trPr>
+        <w:tc>
+          <w:tcPr>
+            <w:tcW w:w="3344" w:type="dxa"/>
+            <w:tcBorders>
+              <w:top w:val="single" w:sz="8" w:space="0" w:color="000000"/>
+              <w:left w:val="single" w:sz="8" w:space="0" w:color="000000"/>
+              <w:bottom w:val="single" w:sz="8" w:space="0" w:color="000000"/>
+              <w:right w:val="single" w:sz="8" w:space="0" w:color="000000"/>
+            </w:tcBorders>
+            <w:vAlign w:val="center"/>
+          </w:tcPr>
+          <w:p>
+            <w:pPr>
+              <w:jc w:val="center"/>
+              <w:rPr>
+                <w:sz w:val="24"/>
+                <w:szCs w:val="24"/>
+              </w:rPr>
+            </w:pPr>
+            <w:r>
+              <w:rPr>
+                <w:b/>
+                <w:sz w:val="24"/>
+                <w:szCs w:val="24"/>
+              </w:rPr>
+              <w:t>ECV</w:t>
+            </w:r>
+          </w:p>
+        </w:tc>
+        <w:tc>
+          <w:tcPr>
+            <w:tcW w:w="469" w:type="dxa"/>
+            <w:tcBorders>
+              <w:top w:val="single" w:sz="8" w:space="0" w:color="000000"/>
+              <w:left w:val="single" w:sz="8" w:space="0" w:color="000000"/>
+              <w:bottom w:val="single" w:sz="8" w:space="0" w:color="000000"/>
+              <w:right w:val="single" w:sz="8" w:space="0" w:color="000000"/>
+            </w:tcBorders>
+            <w:vAlign w:val="center"/>
+          </w:tcPr>
+          <w:p>
+            <w:pPr>
+              <w:jc w:val="center"/>
+            </w:pPr>
+            <w:r>
+              <w:t>:</w:t>
+            </w:r>
+          </w:p>
+        </w:tc>
+        <w:tc>
+          <w:tcPr>
+            <w:tcW w:w="0" w:type="auto"/>
+            <w:tcBorders>
+              <w:top w:val="single" w:sz="8" w:space="0" w:color="000000"/>
+              <w:left w:val="single" w:sz="8" w:space="0" w:color="000000"/>
+              <w:bottom w:val="single" w:sz="8" w:space="0" w:color="000000"/>
+              <w:right w:val="single" w:sz="8" w:space="0" w:color="000000"/>
+            </w:tcBorders>
+            <w:vAlign w:val="center"/>
+          </w:tcPr>
+          <w:p>
+            <w:pPr>
+              <w:jc w:val="both"/>
+              <w:rPr>
+                <w:sz w:val="24"/>
+                <w:szCs w:val="24"/>
+              </w:rPr>
+            </w:pPr>
+            <w:r>
+              <w:rPr>
+                <w:sz w:val="24"/>
+                <w:szCs w:val="24"/>
+              </w:rPr>
+              <w:t xml:space="preserve">{{ECV}}</w:t>
             </w:r>
           </w:p>
         </w:tc>

</xml_diff>

<commit_message>
Release 1.23.0 — Kompally Agreement Bond, corrected 5-page Contract Deed, File Backer NIT/Tender ID, Issue Notice tile UI, preview/scrollbar fixes
Co-Authored-By: Claude Sonnet 5 <noreply@anthropic.com>
</commit_message>
<xml_diff>
--- a/resources/file-backer-template.docx
+++ b/resources/file-backer-template.docx
@@ -15,17 +15,6 @@
       <w:r>
         <w:t xml:space="preserve"> </w:t>
       </w:r>
-    </w:p>
-    <w:p>
-      <w:pPr>
-        <w:pStyle w:val="ListParagraph"/>
-        <w:ind w:left="-709" w:right="-999"/>
-        <w:rPr>
-          <w:rStyle w:val="IntenseReference"/>
-          <w:sz w:val="48"/>
-          <w:szCs w:val="48"/>
-        </w:rPr>
-      </w:pPr>
     </w:p>
     <w:p>
       <w:pPr>
@@ -109,6 +98,176 @@
         <w:gridCol w:w="469"/>
         <w:gridCol w:w="5817"/>
       </w:tblGrid>
+      <w:tr>
+        <w:trPr>
+          <w:cantSplit/>
+          <w:trHeight w:val="812"/>
+          <w:tblCellSpacing w:w="0" w:type="dxa"/>
+          <w:jc w:val="center"/>
+        </w:trPr>
+        <w:tc>
+          <w:tcPr>
+            <w:tcW w:w="3344" w:type="dxa"/>
+            <w:tcBorders>
+              <w:top w:val="single" w:sz="8" w:space="0" w:color="000000"/>
+              <w:left w:val="single" w:sz="8" w:space="0" w:color="000000"/>
+              <w:bottom w:val="single" w:sz="8" w:space="0" w:color="000000"/>
+              <w:right w:val="single" w:sz="8" w:space="0" w:color="000000"/>
+            </w:tcBorders>
+            <w:vAlign w:val="center"/>
+          </w:tcPr>
+          <w:p>
+            <w:pPr>
+              <w:jc w:val="center"/>
+              <w:rPr>
+                <w:sz w:val="24"/>
+                <w:szCs w:val="24"/>
+              </w:rPr>
+            </w:pPr>
+            <w:r>
+              <w:rPr>
+                <w:b/>
+                <w:sz w:val="24"/>
+                <w:szCs w:val="24"/>
+              </w:rPr>
+              <w:t>Tender ID</w:t>
+            </w:r>
+          </w:p>
+        </w:tc>
+        <w:tc>
+          <w:tcPr>
+            <w:tcW w:w="469" w:type="dxa"/>
+            <w:tcBorders>
+              <w:top w:val="single" w:sz="8" w:space="0" w:color="000000"/>
+              <w:left w:val="single" w:sz="8" w:space="0" w:color="000000"/>
+              <w:bottom w:val="single" w:sz="8" w:space="0" w:color="000000"/>
+              <w:right w:val="single" w:sz="8" w:space="0" w:color="000000"/>
+            </w:tcBorders>
+            <w:vAlign w:val="center"/>
+          </w:tcPr>
+          <w:p>
+            <w:pPr>
+              <w:jc w:val="center"/>
+            </w:pPr>
+            <w:r>
+              <w:t>:</w:t>
+            </w:r>
+          </w:p>
+        </w:tc>
+        <w:tc>
+          <w:tcPr>
+            <w:tcW w:w="0" w:type="auto"/>
+            <w:tcBorders>
+              <w:top w:val="single" w:sz="8" w:space="0" w:color="000000"/>
+              <w:left w:val="single" w:sz="8" w:space="0" w:color="000000"/>
+              <w:bottom w:val="single" w:sz="8" w:space="0" w:color="000000"/>
+              <w:right w:val="single" w:sz="8" w:space="0" w:color="000000"/>
+            </w:tcBorders>
+            <w:vAlign w:val="center"/>
+          </w:tcPr>
+          <w:p>
+            <w:pPr>
+              <w:jc w:val="both"/>
+              <w:rPr>
+                <w:sz w:val="24"/>
+                <w:szCs w:val="24"/>
+              </w:rPr>
+            </w:pPr>
+            <w:r>
+              <w:rPr>
+                <w:sz w:val="24"/>
+                <w:szCs w:val="24"/>
+              </w:rPr>
+              <w:t xml:space="preserve">{{Tender ID}}</w:t>
+            </w:r>
+          </w:p>
+        </w:tc>
+      </w:tr>
+      <w:tr>
+        <w:trPr>
+          <w:cantSplit/>
+          <w:trHeight w:val="812"/>
+          <w:tblCellSpacing w:w="0" w:type="dxa"/>
+          <w:jc w:val="center"/>
+        </w:trPr>
+        <w:tc>
+          <w:tcPr>
+            <w:tcW w:w="3344" w:type="dxa"/>
+            <w:tcBorders>
+              <w:top w:val="single" w:sz="8" w:space="0" w:color="000000"/>
+              <w:left w:val="single" w:sz="8" w:space="0" w:color="000000"/>
+              <w:bottom w:val="single" w:sz="8" w:space="0" w:color="000000"/>
+              <w:right w:val="single" w:sz="8" w:space="0" w:color="000000"/>
+            </w:tcBorders>
+            <w:vAlign w:val="center"/>
+          </w:tcPr>
+          <w:p>
+            <w:pPr>
+              <w:jc w:val="center"/>
+              <w:rPr>
+                <w:sz w:val="24"/>
+                <w:szCs w:val="24"/>
+              </w:rPr>
+            </w:pPr>
+            <w:r>
+              <w:rPr>
+                <w:b/>
+                <w:sz w:val="24"/>
+                <w:szCs w:val="24"/>
+              </w:rPr>
+              <w:t>NIT No &amp; Date</w:t>
+            </w:r>
+          </w:p>
+        </w:tc>
+        <w:tc>
+          <w:tcPr>
+            <w:tcW w:w="469" w:type="dxa"/>
+            <w:tcBorders>
+              <w:top w:val="single" w:sz="8" w:space="0" w:color="000000"/>
+              <w:left w:val="single" w:sz="8" w:space="0" w:color="000000"/>
+              <w:bottom w:val="single" w:sz="8" w:space="0" w:color="000000"/>
+              <w:right w:val="single" w:sz="8" w:space="0" w:color="000000"/>
+            </w:tcBorders>
+            <w:vAlign w:val="center"/>
+          </w:tcPr>
+          <w:p>
+            <w:pPr>
+              <w:jc w:val="center"/>
+            </w:pPr>
+            <w:r>
+              <w:t>:</w:t>
+            </w:r>
+          </w:p>
+        </w:tc>
+        <w:tc>
+          <w:tcPr>
+            <w:tcW w:w="0" w:type="auto"/>
+            <w:tcBorders>
+              <w:top w:val="single" w:sz="8" w:space="0" w:color="000000"/>
+              <w:left w:val="single" w:sz="8" w:space="0" w:color="000000"/>
+              <w:bottom w:val="single" w:sz="8" w:space="0" w:color="000000"/>
+              <w:right w:val="single" w:sz="8" w:space="0" w:color="000000"/>
+            </w:tcBorders>
+            <w:vAlign w:val="center"/>
+          </w:tcPr>
+          <w:p>
+            <w:pPr>
+              <w:jc w:val="both"/>
+              <w:rPr>
+                <w:sz w:val="24"/>
+                <w:szCs w:val="24"/>
+              </w:rPr>
+            </w:pPr>
+            <w:r>
+              <w:rPr>
+                <w:sz w:val="24"/>
+                <w:szCs w:val="24"/>
+              </w:rPr>
+              <w:t xml:space="preserve">{{NIT No}}, Dt. {{NIT Date}}</w:t>
+            </w:r>
+          </w:p>
+        </w:tc>
+      </w:tr>
       <w:tr>
         <w:trPr>
           <w:cantSplit/>

</xml_diff>